<commit_message>
update doc for cannot auto detect via per juni 2026
</commit_message>
<xml_diff>
--- a/DOC/word/Kertas Panduan ZEAPAD PRO.docx
+++ b/DOC/word/Kertas Panduan ZEAPAD PRO.docx
@@ -1,6 +1,6 @@
 
 <file path=word/document.xml><?xml version="1.0" encoding="utf-8"?>
-<w:document xmlns:wpc="http://schemas.microsoft.com/office/word/2010/wordprocessingCanvas" xmlns:cx="http://schemas.microsoft.com/office/drawing/2014/chartex" xmlns:cx1="http://schemas.microsoft.com/office/drawing/2015/9/8/chartex" xmlns:cx2="http://schemas.microsoft.com/office/drawing/2015/10/21/chartex" xmlns:cx3="http://schemas.microsoft.com/office/drawing/2016/5/9/chartex" xmlns:cx4="http://schemas.microsoft.com/office/drawing/2016/5/10/chartex" xmlns:cx5="http://schemas.microsoft.com/office/drawing/2016/5/11/chartex" xmlns:cx6="http://schemas.microsoft.com/office/drawing/2016/5/12/chartex" xmlns:cx7="http://schemas.microsoft.com/office/drawing/2016/5/13/chartex" xmlns:cx8="http://schemas.microsoft.com/office/drawing/2016/5/14/chartex" xmlns:mc="http://schemas.openxmlformats.org/markup-compatibility/2006" xmlns:aink="http://schemas.microsoft.com/office/drawing/2016/ink" xmlns:am3d="http://schemas.microsoft.com/office/drawing/2017/model3d" xmlns:o="urn:schemas-microsoft-com:office:office" xmlns:oel="http://schemas.microsoft.com/office/2019/extlst" xmlns:r="http://schemas.openxmlformats.org/officeDocument/2006/relationships" xmlns:m="http://schemas.openxmlformats.org/officeDocument/2006/math" xmlns:v="urn:schemas-microsoft-com:vml" xmlns:wp14="http://schemas.microsoft.com/office/word/2010/wordprocessingDrawing" xmlns:wp="http://schemas.openxmlformats.org/drawingml/2006/wordprocessingDrawing" xmlns:w10="urn:schemas-microsoft-com:office:word" xmlns:w="http://schemas.openxmlformats.org/wordprocessingml/2006/main" xmlns:w14="http://schemas.microsoft.com/office/word/2010/wordml" xmlns:w15="http://schemas.microsoft.com/office/word/2012/wordml" xmlns:w16cex="http://schemas.microsoft.com/office/word/2018/wordml/cex" xmlns:w16cid="http://schemas.microsoft.com/office/word/2016/wordml/cid" xmlns:w16="http://schemas.microsoft.com/office/word/2018/wordml" xmlns:w16du="http://schemas.microsoft.com/office/word/2023/wordml/word16du" xmlns:w16sdtdh="http://schemas.microsoft.com/office/word/2020/wordml/sdtdatahash" xmlns:w16se="http://schemas.microsoft.com/office/word/2015/wordml/symex" xmlns:wpg="http://schemas.microsoft.com/office/word/2010/wordprocessingGroup" xmlns:wpi="http://schemas.microsoft.com/office/word/2010/wordprocessingInk" xmlns:wne="http://schemas.microsoft.com/office/word/2006/wordml" xmlns:wps="http://schemas.microsoft.com/office/word/2010/wordprocessingShape" mc:Ignorable="w14 w15 w16se w16cid w16 w16cex w16sdtdh w16du wp14">
+<w:document xmlns:wpc="http://schemas.microsoft.com/office/word/2010/wordprocessingCanvas" xmlns:cx="http://schemas.microsoft.com/office/drawing/2014/chartex" xmlns:cx1="http://schemas.microsoft.com/office/drawing/2015/9/8/chartex" xmlns:cx2="http://schemas.microsoft.com/office/drawing/2015/10/21/chartex" xmlns:cx3="http://schemas.microsoft.com/office/drawing/2016/5/9/chartex" xmlns:cx4="http://schemas.microsoft.com/office/drawing/2016/5/10/chartex" xmlns:cx5="http://schemas.microsoft.com/office/drawing/2016/5/11/chartex" xmlns:cx6="http://schemas.microsoft.com/office/drawing/2016/5/12/chartex" xmlns:cx7="http://schemas.microsoft.com/office/drawing/2016/5/13/chartex" xmlns:cx8="http://schemas.microsoft.com/office/drawing/2016/5/14/chartex" xmlns:mc="http://schemas.openxmlformats.org/markup-compatibility/2006" xmlns:aink="http://schemas.microsoft.com/office/drawing/2016/ink" xmlns:am3d="http://schemas.microsoft.com/office/drawing/2017/model3d" xmlns:o="urn:schemas-microsoft-com:office:office" xmlns:oel="http://schemas.microsoft.com/office/2019/extlst" xmlns:r="http://schemas.openxmlformats.org/officeDocument/2006/relationships" xmlns:m="http://schemas.openxmlformats.org/officeDocument/2006/math" xmlns:v="urn:schemas-microsoft-com:vml" xmlns:wp14="http://schemas.microsoft.com/office/word/2010/wordprocessingDrawing" xmlns:wp="http://schemas.openxmlformats.org/drawingml/2006/wordprocessingDrawing" xmlns:w10="urn:schemas-microsoft-com:office:word" xmlns:w="http://schemas.openxmlformats.org/wordprocessingml/2006/main" xmlns:w14="http://schemas.microsoft.com/office/word/2010/wordml" xmlns:w15="http://schemas.microsoft.com/office/word/2012/wordml" xmlns:w16cex="http://schemas.microsoft.com/office/word/2018/wordml/cex" xmlns:w16cid="http://schemas.microsoft.com/office/word/2016/wordml/cid" xmlns:w16="http://schemas.microsoft.com/office/word/2018/wordml" xmlns:w16du="http://schemas.microsoft.com/office/word/2023/wordml/word16du" xmlns:w16sdtdh="http://schemas.microsoft.com/office/word/2020/wordml/sdtdatahash" xmlns:w16sdtfl="http://schemas.microsoft.com/office/word/2024/wordml/sdtformatlock" xmlns:w16se="http://schemas.microsoft.com/office/word/2015/wordml/symex" xmlns:wpg="http://schemas.microsoft.com/office/word/2010/wordprocessingGroup" xmlns:wpi="http://schemas.microsoft.com/office/word/2010/wordprocessingInk" xmlns:wne="http://schemas.microsoft.com/office/word/2006/wordml" xmlns:wps="http://schemas.microsoft.com/office/word/2010/wordprocessingShape" mc:Ignorable="w14 w15 w16se w16cid w16 w16cex w16sdtdh w16sdtfl w16du wp14">
   <w:body>
     <w:p>
       <w:pPr>
@@ -13,12 +13,101 @@
           <w:szCs w:val="24"/>
         </w:rPr>
       </w:pPr>
-      <w:r>
-        <w:rPr>
-          <w:sz w:val="24"/>
-          <w:szCs w:val="24"/>
-        </w:rPr>
-        <w:t>Untuk Documentasi Lengkapnya anda dapat membuka link google drive dibawah ini</w:t>
+      <w:proofErr w:type="spellStart"/>
+      <w:r>
+        <w:rPr>
+          <w:sz w:val="24"/>
+          <w:szCs w:val="24"/>
+        </w:rPr>
+        <w:t>Untuk</w:t>
+      </w:r>
+      <w:proofErr w:type="spellEnd"/>
+      <w:r>
+        <w:rPr>
+          <w:sz w:val="24"/>
+          <w:szCs w:val="24"/>
+        </w:rPr>
+        <w:t xml:space="preserve"> </w:t>
+      </w:r>
+      <w:proofErr w:type="spellStart"/>
+      <w:r>
+        <w:rPr>
+          <w:sz w:val="24"/>
+          <w:szCs w:val="24"/>
+        </w:rPr>
+        <w:t>Documentasi</w:t>
+      </w:r>
+      <w:proofErr w:type="spellEnd"/>
+      <w:r>
+        <w:rPr>
+          <w:sz w:val="24"/>
+          <w:szCs w:val="24"/>
+        </w:rPr>
+        <w:t xml:space="preserve"> </w:t>
+      </w:r>
+      <w:proofErr w:type="spellStart"/>
+      <w:r>
+        <w:rPr>
+          <w:sz w:val="24"/>
+          <w:szCs w:val="24"/>
+        </w:rPr>
+        <w:t>Lengkapnya</w:t>
+      </w:r>
+      <w:proofErr w:type="spellEnd"/>
+      <w:r>
+        <w:rPr>
+          <w:sz w:val="24"/>
+          <w:szCs w:val="24"/>
+        </w:rPr>
+        <w:t xml:space="preserve"> </w:t>
+      </w:r>
+      <w:proofErr w:type="spellStart"/>
+      <w:r>
+        <w:rPr>
+          <w:sz w:val="24"/>
+          <w:szCs w:val="24"/>
+        </w:rPr>
+        <w:t>anda</w:t>
+      </w:r>
+      <w:proofErr w:type="spellEnd"/>
+      <w:r>
+        <w:rPr>
+          <w:sz w:val="24"/>
+          <w:szCs w:val="24"/>
+        </w:rPr>
+        <w:t xml:space="preserve"> dapat </w:t>
+      </w:r>
+      <w:proofErr w:type="spellStart"/>
+      <w:r>
+        <w:rPr>
+          <w:sz w:val="24"/>
+          <w:szCs w:val="24"/>
+        </w:rPr>
+        <w:t>membuka</w:t>
+      </w:r>
+      <w:proofErr w:type="spellEnd"/>
+      <w:r>
+        <w:rPr>
+          <w:sz w:val="24"/>
+          <w:szCs w:val="24"/>
+        </w:rPr>
+        <w:t xml:space="preserve"> link google drive </w:t>
+      </w:r>
+      <w:proofErr w:type="spellStart"/>
+      <w:r>
+        <w:rPr>
+          <w:sz w:val="24"/>
+          <w:szCs w:val="24"/>
+        </w:rPr>
+        <w:t>dibawah</w:t>
+      </w:r>
+      <w:proofErr w:type="spellEnd"/>
+      <w:r>
+        <w:rPr>
+          <w:sz w:val="24"/>
+          <w:szCs w:val="24"/>
+        </w:rPr>
+        <w:t xml:space="preserve"> ini</w:t>
       </w:r>
     </w:p>
     <w:p>
@@ -29,13 +118,16 @@
           <w:szCs w:val="24"/>
         </w:rPr>
       </w:pPr>
-      <w:r>
-        <w:rPr>
-          <w:sz w:val="24"/>
-          <w:szCs w:val="24"/>
-        </w:rPr>
-        <w:t>https://tinyurl.com/2pb7x2p5</w:t>
-      </w:r>
+      <w:hyperlink r:id="rId6" w:history="1">
+        <w:r>
+          <w:rPr>
+            <w:rStyle w:val="Hyperlink"/>
+            <w:sz w:val="24"/>
+            <w:szCs w:val="24"/>
+          </w:rPr>
+          <w:t>https://github.com/juarendra/Zeapad-Pro-QMK-VIA</w:t>
+        </w:r>
+      </w:hyperlink>
     </w:p>
     <w:p>
       <w:pPr>
@@ -57,12 +149,133 @@
           <w:szCs w:val="24"/>
         </w:rPr>
       </w:pPr>
-      <w:r>
-        <w:rPr>
-          <w:sz w:val="24"/>
-          <w:szCs w:val="24"/>
-        </w:rPr>
-        <w:t>Lihat dahulu video untuk mengetahui cara pengunaan macropad dengan software VIA</w:t>
+      <w:proofErr w:type="spellStart"/>
+      <w:r>
+        <w:rPr>
+          <w:sz w:val="24"/>
+          <w:szCs w:val="24"/>
+        </w:rPr>
+        <w:t>Lihat</w:t>
+      </w:r>
+      <w:proofErr w:type="spellEnd"/>
+      <w:r>
+        <w:rPr>
+          <w:sz w:val="24"/>
+          <w:szCs w:val="24"/>
+        </w:rPr>
+        <w:t xml:space="preserve"> </w:t>
+      </w:r>
+      <w:proofErr w:type="spellStart"/>
+      <w:r>
+        <w:rPr>
+          <w:sz w:val="24"/>
+          <w:szCs w:val="24"/>
+        </w:rPr>
+        <w:t>dahulu</w:t>
+      </w:r>
+      <w:proofErr w:type="spellEnd"/>
+      <w:r>
+        <w:rPr>
+          <w:sz w:val="24"/>
+          <w:szCs w:val="24"/>
+        </w:rPr>
+        <w:t xml:space="preserve"> video </w:t>
+      </w:r>
+      <w:proofErr w:type="spellStart"/>
+      <w:r>
+        <w:rPr>
+          <w:sz w:val="24"/>
+          <w:szCs w:val="24"/>
+        </w:rPr>
+        <w:t>untuk</w:t>
+      </w:r>
+      <w:proofErr w:type="spellEnd"/>
+      <w:r>
+        <w:rPr>
+          <w:sz w:val="24"/>
+          <w:szCs w:val="24"/>
+        </w:rPr>
+        <w:t xml:space="preserve"> </w:t>
+      </w:r>
+      <w:proofErr w:type="spellStart"/>
+      <w:r>
+        <w:rPr>
+          <w:sz w:val="24"/>
+          <w:szCs w:val="24"/>
+        </w:rPr>
+        <w:t>mengetahui</w:t>
+      </w:r>
+      <w:proofErr w:type="spellEnd"/>
+      <w:r>
+        <w:rPr>
+          <w:sz w:val="24"/>
+          <w:szCs w:val="24"/>
+        </w:rPr>
+        <w:t xml:space="preserve"> </w:t>
+      </w:r>
+      <w:proofErr w:type="spellStart"/>
+      <w:r>
+        <w:rPr>
+          <w:sz w:val="24"/>
+          <w:szCs w:val="24"/>
+        </w:rPr>
+        <w:t>cara</w:t>
+      </w:r>
+      <w:proofErr w:type="spellEnd"/>
+      <w:r>
+        <w:rPr>
+          <w:sz w:val="24"/>
+          <w:szCs w:val="24"/>
+        </w:rPr>
+        <w:t xml:space="preserve"> </w:t>
+      </w:r>
+      <w:proofErr w:type="spellStart"/>
+      <w:r>
+        <w:rPr>
+          <w:sz w:val="24"/>
+          <w:szCs w:val="24"/>
+        </w:rPr>
+        <w:t>pengunaan</w:t>
+      </w:r>
+      <w:proofErr w:type="spellEnd"/>
+      <w:r>
+        <w:rPr>
+          <w:sz w:val="24"/>
+          <w:szCs w:val="24"/>
+        </w:rPr>
+        <w:t xml:space="preserve"> </w:t>
+      </w:r>
+      <w:proofErr w:type="spellStart"/>
+      <w:r>
+        <w:rPr>
+          <w:sz w:val="24"/>
+          <w:szCs w:val="24"/>
+        </w:rPr>
+        <w:t>macropad</w:t>
+      </w:r>
+      <w:proofErr w:type="spellEnd"/>
+      <w:r>
+        <w:rPr>
+          <w:sz w:val="24"/>
+          <w:szCs w:val="24"/>
+        </w:rPr>
+        <w:t xml:space="preserve"> </w:t>
+      </w:r>
+      <w:proofErr w:type="spellStart"/>
+      <w:r>
+        <w:rPr>
+          <w:sz w:val="24"/>
+          <w:szCs w:val="24"/>
+        </w:rPr>
+        <w:t>dengan</w:t>
+      </w:r>
+      <w:proofErr w:type="spellEnd"/>
+      <w:r>
+        <w:rPr>
+          <w:sz w:val="24"/>
+          <w:szCs w:val="24"/>
+        </w:rPr>
+        <w:t xml:space="preserve"> software VIA</w:t>
       </w:r>
     </w:p>
     <w:p>
@@ -84,12 +297,37 @@
           <w:szCs w:val="24"/>
         </w:rPr>
       </w:pPr>
-      <w:r>
-        <w:rPr>
-          <w:sz w:val="24"/>
-          <w:szCs w:val="24"/>
-        </w:rPr>
-        <w:t>Fungsi file file di google drive</w:t>
+      <w:proofErr w:type="spellStart"/>
+      <w:r>
+        <w:rPr>
+          <w:sz w:val="24"/>
+          <w:szCs w:val="24"/>
+        </w:rPr>
+        <w:t>Fungsi</w:t>
+      </w:r>
+      <w:proofErr w:type="spellEnd"/>
+      <w:r>
+        <w:rPr>
+          <w:sz w:val="24"/>
+          <w:szCs w:val="24"/>
+        </w:rPr>
+        <w:t xml:space="preserve"> file </w:t>
+      </w:r>
+      <w:proofErr w:type="spellStart"/>
+      <w:r>
+        <w:rPr>
+          <w:sz w:val="24"/>
+          <w:szCs w:val="24"/>
+        </w:rPr>
+        <w:t>file</w:t>
+      </w:r>
+      <w:proofErr w:type="spellEnd"/>
+      <w:r>
+        <w:rPr>
+          <w:sz w:val="24"/>
+          <w:szCs w:val="24"/>
+        </w:rPr>
+        <w:t xml:space="preserve"> di google drive</w:t>
       </w:r>
     </w:p>
     <w:p>
@@ -108,7 +346,103 @@
           <w:sz w:val="24"/>
           <w:szCs w:val="24"/>
         </w:rPr>
-        <w:t>Link Keycode.txt  = berisi link yang menunjukan list keycode yang dapat digunakan dalam melakukan setting keymap</w:t>
+        <w:t xml:space="preserve">Link </w:t>
+      </w:r>
+      <w:proofErr w:type="gramStart"/>
+      <w:r>
+        <w:rPr>
+          <w:sz w:val="24"/>
+          <w:szCs w:val="24"/>
+        </w:rPr>
+        <w:t>Keycode.txt  =</w:t>
+      </w:r>
+      <w:proofErr w:type="gramEnd"/>
+      <w:r>
+        <w:rPr>
+          <w:sz w:val="24"/>
+          <w:szCs w:val="24"/>
+        </w:rPr>
+        <w:t xml:space="preserve"> </w:t>
+      </w:r>
+      <w:proofErr w:type="spellStart"/>
+      <w:r>
+        <w:rPr>
+          <w:sz w:val="24"/>
+          <w:szCs w:val="24"/>
+        </w:rPr>
+        <w:t>berisi</w:t>
+      </w:r>
+      <w:proofErr w:type="spellEnd"/>
+      <w:r>
+        <w:rPr>
+          <w:sz w:val="24"/>
+          <w:szCs w:val="24"/>
+        </w:rPr>
+        <w:t xml:space="preserve"> link yang </w:t>
+      </w:r>
+      <w:proofErr w:type="spellStart"/>
+      <w:r>
+        <w:rPr>
+          <w:sz w:val="24"/>
+          <w:szCs w:val="24"/>
+        </w:rPr>
+        <w:t>menunjukan</w:t>
+      </w:r>
+      <w:proofErr w:type="spellEnd"/>
+      <w:r>
+        <w:rPr>
+          <w:sz w:val="24"/>
+          <w:szCs w:val="24"/>
+        </w:rPr>
+        <w:t xml:space="preserve"> list keycode yang dapat </w:t>
+      </w:r>
+      <w:proofErr w:type="spellStart"/>
+      <w:r>
+        <w:rPr>
+          <w:sz w:val="24"/>
+          <w:szCs w:val="24"/>
+        </w:rPr>
+        <w:t>digunakan</w:t>
+      </w:r>
+      <w:proofErr w:type="spellEnd"/>
+      <w:r>
+        <w:rPr>
+          <w:sz w:val="24"/>
+          <w:szCs w:val="24"/>
+        </w:rPr>
+        <w:t xml:space="preserve"> </w:t>
+      </w:r>
+      <w:proofErr w:type="spellStart"/>
+      <w:r>
+        <w:rPr>
+          <w:sz w:val="24"/>
+          <w:szCs w:val="24"/>
+        </w:rPr>
+        <w:t>dalam</w:t>
+      </w:r>
+      <w:proofErr w:type="spellEnd"/>
+      <w:r>
+        <w:rPr>
+          <w:sz w:val="24"/>
+          <w:szCs w:val="24"/>
+        </w:rPr>
+        <w:t xml:space="preserve"> </w:t>
+      </w:r>
+      <w:proofErr w:type="spellStart"/>
+      <w:r>
+        <w:rPr>
+          <w:sz w:val="24"/>
+          <w:szCs w:val="24"/>
+        </w:rPr>
+        <w:t>melakukan</w:t>
+      </w:r>
+      <w:proofErr w:type="spellEnd"/>
+      <w:r>
+        <w:rPr>
+          <w:sz w:val="24"/>
+          <w:szCs w:val="24"/>
+        </w:rPr>
+        <w:t xml:space="preserve"> setting keymap</w:t>
       </w:r>
     </w:p>
     <w:p>
@@ -127,7 +461,55 @@
           <w:sz w:val="24"/>
           <w:szCs w:val="24"/>
         </w:rPr>
-        <w:t>TUTORIAL MACRO ON VIA CONFIGURATOR.txt = berisi link tutorial cara membuat macro di software via</w:t>
+        <w:t xml:space="preserve">TUTORIAL MACRO ON VIA CONFIGURATOR.txt = </w:t>
+      </w:r>
+      <w:proofErr w:type="spellStart"/>
+      <w:r>
+        <w:rPr>
+          <w:sz w:val="24"/>
+          <w:szCs w:val="24"/>
+        </w:rPr>
+        <w:t>berisi</w:t>
+      </w:r>
+      <w:proofErr w:type="spellEnd"/>
+      <w:r>
+        <w:rPr>
+          <w:sz w:val="24"/>
+          <w:szCs w:val="24"/>
+        </w:rPr>
+        <w:t xml:space="preserve"> link tutorial </w:t>
+      </w:r>
+      <w:proofErr w:type="spellStart"/>
+      <w:r>
+        <w:rPr>
+          <w:sz w:val="24"/>
+          <w:szCs w:val="24"/>
+        </w:rPr>
+        <w:t>cara</w:t>
+      </w:r>
+      <w:proofErr w:type="spellEnd"/>
+      <w:r>
+        <w:rPr>
+          <w:sz w:val="24"/>
+          <w:szCs w:val="24"/>
+        </w:rPr>
+        <w:t xml:space="preserve"> </w:t>
+      </w:r>
+      <w:proofErr w:type="spellStart"/>
+      <w:r>
+        <w:rPr>
+          <w:sz w:val="24"/>
+          <w:szCs w:val="24"/>
+        </w:rPr>
+        <w:t>membuat</w:t>
+      </w:r>
+      <w:proofErr w:type="spellEnd"/>
+      <w:r>
+        <w:rPr>
+          <w:sz w:val="24"/>
+          <w:szCs w:val="24"/>
+        </w:rPr>
+        <w:t xml:space="preserve"> macro di software via</w:t>
       </w:r>
     </w:p>
     <w:p>
@@ -146,8 +528,42 @@
           <w:sz w:val="24"/>
           <w:szCs w:val="24"/>
         </w:rPr>
-        <w:t>LINK TUTORIAL PENGGUNAAN.txt =  berisi link video tutorial penggunaan</w:t>
-      </w:r>
+        <w:t xml:space="preserve">LINK TUTORIAL PENGGUNAAN.txt </w:t>
+      </w:r>
+      <w:proofErr w:type="gramStart"/>
+      <w:r>
+        <w:rPr>
+          <w:sz w:val="24"/>
+          <w:szCs w:val="24"/>
+        </w:rPr>
+        <w:t xml:space="preserve">=  </w:t>
+      </w:r>
+      <w:proofErr w:type="spellStart"/>
+      <w:r>
+        <w:rPr>
+          <w:sz w:val="24"/>
+          <w:szCs w:val="24"/>
+        </w:rPr>
+        <w:t>berisi</w:t>
+      </w:r>
+      <w:proofErr w:type="spellEnd"/>
+      <w:proofErr w:type="gramEnd"/>
+      <w:r>
+        <w:rPr>
+          <w:sz w:val="24"/>
+          <w:szCs w:val="24"/>
+        </w:rPr>
+        <w:t xml:space="preserve"> link video tutorial </w:t>
+      </w:r>
+      <w:proofErr w:type="spellStart"/>
+      <w:r>
+        <w:rPr>
+          <w:sz w:val="24"/>
+          <w:szCs w:val="24"/>
+        </w:rPr>
+        <w:t>penggunaan</w:t>
+      </w:r>
+      <w:proofErr w:type="spellEnd"/>
     </w:p>
     <w:p>
       <w:pPr>
@@ -165,7 +581,135 @@
           <w:sz w:val="24"/>
           <w:szCs w:val="24"/>
         </w:rPr>
-        <w:t>TUTORIAL MEMBUAT TOMBOL PINDAH LAYER.txt = berisi panduan untuk merubah fungsi tombol sebagai trigger memindahkan layer</w:t>
+        <w:t xml:space="preserve">TUTORIAL MEMBUAT TOMBOL PINDAH LAYER.txt = </w:t>
+      </w:r>
+      <w:proofErr w:type="spellStart"/>
+      <w:r>
+        <w:rPr>
+          <w:sz w:val="24"/>
+          <w:szCs w:val="24"/>
+        </w:rPr>
+        <w:t>berisi</w:t>
+      </w:r>
+      <w:proofErr w:type="spellEnd"/>
+      <w:r>
+        <w:rPr>
+          <w:sz w:val="24"/>
+          <w:szCs w:val="24"/>
+        </w:rPr>
+        <w:t xml:space="preserve"> </w:t>
+      </w:r>
+      <w:proofErr w:type="spellStart"/>
+      <w:r>
+        <w:rPr>
+          <w:sz w:val="24"/>
+          <w:szCs w:val="24"/>
+        </w:rPr>
+        <w:t>panduan</w:t>
+      </w:r>
+      <w:proofErr w:type="spellEnd"/>
+      <w:r>
+        <w:rPr>
+          <w:sz w:val="24"/>
+          <w:szCs w:val="24"/>
+        </w:rPr>
+        <w:t xml:space="preserve"> </w:t>
+      </w:r>
+      <w:proofErr w:type="spellStart"/>
+      <w:r>
+        <w:rPr>
+          <w:sz w:val="24"/>
+          <w:szCs w:val="24"/>
+        </w:rPr>
+        <w:t>untuk</w:t>
+      </w:r>
+      <w:proofErr w:type="spellEnd"/>
+      <w:r>
+        <w:rPr>
+          <w:sz w:val="24"/>
+          <w:szCs w:val="24"/>
+        </w:rPr>
+        <w:t xml:space="preserve"> </w:t>
+      </w:r>
+      <w:proofErr w:type="spellStart"/>
+      <w:r>
+        <w:rPr>
+          <w:sz w:val="24"/>
+          <w:szCs w:val="24"/>
+        </w:rPr>
+        <w:t>merubah</w:t>
+      </w:r>
+      <w:proofErr w:type="spellEnd"/>
+      <w:r>
+        <w:rPr>
+          <w:sz w:val="24"/>
+          <w:szCs w:val="24"/>
+        </w:rPr>
+        <w:t xml:space="preserve"> </w:t>
+      </w:r>
+      <w:proofErr w:type="spellStart"/>
+      <w:r>
+        <w:rPr>
+          <w:sz w:val="24"/>
+          <w:szCs w:val="24"/>
+        </w:rPr>
+        <w:t>fungsi</w:t>
+      </w:r>
+      <w:proofErr w:type="spellEnd"/>
+      <w:r>
+        <w:rPr>
+          <w:sz w:val="24"/>
+          <w:szCs w:val="24"/>
+        </w:rPr>
+        <w:t xml:space="preserve"> </w:t>
+      </w:r>
+      <w:proofErr w:type="spellStart"/>
+      <w:r>
+        <w:rPr>
+          <w:sz w:val="24"/>
+          <w:szCs w:val="24"/>
+        </w:rPr>
+        <w:t>tombol</w:t>
+      </w:r>
+      <w:proofErr w:type="spellEnd"/>
+      <w:r>
+        <w:rPr>
+          <w:sz w:val="24"/>
+          <w:szCs w:val="24"/>
+        </w:rPr>
+        <w:t xml:space="preserve"> </w:t>
+      </w:r>
+      <w:proofErr w:type="spellStart"/>
+      <w:r>
+        <w:rPr>
+          <w:sz w:val="24"/>
+          <w:szCs w:val="24"/>
+        </w:rPr>
+        <w:t>sebagai</w:t>
+      </w:r>
+      <w:proofErr w:type="spellEnd"/>
+      <w:r>
+        <w:rPr>
+          <w:sz w:val="24"/>
+          <w:szCs w:val="24"/>
+        </w:rPr>
+        <w:t xml:space="preserve"> trigger </w:t>
+      </w:r>
+      <w:proofErr w:type="spellStart"/>
+      <w:r>
+        <w:rPr>
+          <w:sz w:val="24"/>
+          <w:szCs w:val="24"/>
+        </w:rPr>
+        <w:t>memindahkan</w:t>
+      </w:r>
+      <w:proofErr w:type="spellEnd"/>
+      <w:r>
+        <w:rPr>
+          <w:sz w:val="24"/>
+          <w:szCs w:val="24"/>
+        </w:rPr>
+        <w:t xml:space="preserve"> layer</w:t>
       </w:r>
     </w:p>
     <w:p>
@@ -175,41 +719,330 @@
           <w:numId w:val="1"/>
         </w:numPr>
         <w:rPr>
-          <w:sz w:val="24"/>
-          <w:szCs w:val="24"/>
-        </w:rPr>
-      </w:pPr>
-      <w:r>
-        <w:rPr>
-          <w:sz w:val="24"/>
-          <w:szCs w:val="24"/>
-        </w:rPr>
-        <w:t>lianumpad_via_definitions.json = File json yang perlu dimasukkan ke VIA</w:t>
-      </w:r>
-    </w:p>
-    <w:p>
-      <w:pPr>
-        <w:rPr>
-          <w:sz w:val="24"/>
-          <w:szCs w:val="24"/>
-        </w:rPr>
-      </w:pPr>
-    </w:p>
-    <w:p>
-      <w:pPr>
-        <w:rPr>
-          <w:sz w:val="24"/>
-          <w:szCs w:val="24"/>
-        </w:rPr>
-      </w:pPr>
-      <w:r>
-        <w:rPr>
-          <w:sz w:val="24"/>
-          <w:szCs w:val="24"/>
-        </w:rPr>
-        <w:t xml:space="preserve">Untuk panduan lainnya menggunakan software via ada dapat membacanya disini </w:t>
-      </w:r>
-      <w:hyperlink r:id="rId6">
+          <w:b/>
+          <w:bCs/>
+          <w:sz w:val="24"/>
+          <w:szCs w:val="24"/>
+        </w:rPr>
+      </w:pPr>
+      <w:proofErr w:type="spellStart"/>
+      <w:r>
+        <w:rPr>
+          <w:b/>
+          <w:bCs/>
+          <w:sz w:val="24"/>
+          <w:szCs w:val="24"/>
+        </w:rPr>
+        <w:t>zeapadpro_via_</w:t>
+      </w:r>
+      <w:proofErr w:type="gramStart"/>
+      <w:r>
+        <w:rPr>
+          <w:b/>
+          <w:bCs/>
+          <w:sz w:val="24"/>
+          <w:szCs w:val="24"/>
+        </w:rPr>
+        <w:t>definitions</w:t>
+      </w:r>
+      <w:proofErr w:type="spellEnd"/>
+      <w:r>
+        <w:rPr>
+          <w:b/>
+          <w:bCs/>
+          <w:sz w:val="24"/>
+          <w:szCs w:val="24"/>
+        </w:rPr>
+        <w:t xml:space="preserve"> .</w:t>
+      </w:r>
+      <w:proofErr w:type="spellStart"/>
+      <w:r>
+        <w:rPr>
+          <w:b/>
+          <w:bCs/>
+          <w:sz w:val="24"/>
+          <w:szCs w:val="24"/>
+        </w:rPr>
+        <w:t>json</w:t>
+      </w:r>
+      <w:proofErr w:type="spellEnd"/>
+      <w:proofErr w:type="gramEnd"/>
+      <w:r>
+        <w:rPr>
+          <w:b/>
+          <w:bCs/>
+          <w:sz w:val="24"/>
+          <w:szCs w:val="24"/>
+        </w:rPr>
+        <w:t xml:space="preserve"> </w:t>
+      </w:r>
+      <w:r>
+        <w:rPr>
+          <w:b/>
+          <w:bCs/>
+          <w:sz w:val="24"/>
+          <w:szCs w:val="24"/>
+        </w:rPr>
+        <w:t xml:space="preserve">= File </w:t>
+      </w:r>
+      <w:proofErr w:type="spellStart"/>
+      <w:r>
+        <w:rPr>
+          <w:b/>
+          <w:bCs/>
+          <w:sz w:val="24"/>
+          <w:szCs w:val="24"/>
+        </w:rPr>
+        <w:t>json</w:t>
+      </w:r>
+      <w:proofErr w:type="spellEnd"/>
+      <w:r>
+        <w:rPr>
+          <w:b/>
+          <w:bCs/>
+          <w:sz w:val="24"/>
+          <w:szCs w:val="24"/>
+        </w:rPr>
+        <w:t xml:space="preserve"> yang </w:t>
+      </w:r>
+      <w:proofErr w:type="spellStart"/>
+      <w:r>
+        <w:rPr>
+          <w:b/>
+          <w:bCs/>
+          <w:sz w:val="24"/>
+          <w:szCs w:val="24"/>
+        </w:rPr>
+        <w:t>perlu</w:t>
+      </w:r>
+      <w:proofErr w:type="spellEnd"/>
+      <w:r>
+        <w:rPr>
+          <w:b/>
+          <w:bCs/>
+          <w:sz w:val="24"/>
+          <w:szCs w:val="24"/>
+        </w:rPr>
+        <w:t xml:space="preserve"> </w:t>
+      </w:r>
+      <w:proofErr w:type="spellStart"/>
+      <w:r>
+        <w:rPr>
+          <w:b/>
+          <w:bCs/>
+          <w:sz w:val="24"/>
+          <w:szCs w:val="24"/>
+        </w:rPr>
+        <w:t>dimasukkan</w:t>
+      </w:r>
+      <w:proofErr w:type="spellEnd"/>
+      <w:r>
+        <w:rPr>
+          <w:b/>
+          <w:bCs/>
+          <w:sz w:val="24"/>
+          <w:szCs w:val="24"/>
+        </w:rPr>
+        <w:t xml:space="preserve"> </w:t>
+      </w:r>
+      <w:proofErr w:type="spellStart"/>
+      <w:r>
+        <w:rPr>
+          <w:b/>
+          <w:bCs/>
+          <w:sz w:val="24"/>
+          <w:szCs w:val="24"/>
+        </w:rPr>
+        <w:t>ke</w:t>
+      </w:r>
+      <w:proofErr w:type="spellEnd"/>
+      <w:r>
+        <w:rPr>
+          <w:b/>
+          <w:bCs/>
+          <w:sz w:val="24"/>
+          <w:szCs w:val="24"/>
+        </w:rPr>
+        <w:t xml:space="preserve"> VIA</w:t>
+      </w:r>
+      <w:r>
+        <w:rPr>
+          <w:b/>
+          <w:bCs/>
+          <w:sz w:val="24"/>
+          <w:szCs w:val="24"/>
+        </w:rPr>
+        <w:t xml:space="preserve"> </w:t>
+      </w:r>
+      <w:proofErr w:type="spellStart"/>
+      <w:r>
+        <w:rPr>
+          <w:b/>
+          <w:bCs/>
+          <w:sz w:val="24"/>
+          <w:szCs w:val="24"/>
+        </w:rPr>
+        <w:t>perlu</w:t>
+      </w:r>
+      <w:proofErr w:type="spellEnd"/>
+      <w:r>
+        <w:rPr>
+          <w:b/>
+          <w:bCs/>
+          <w:sz w:val="24"/>
+          <w:szCs w:val="24"/>
+        </w:rPr>
+        <w:t xml:space="preserve"> input </w:t>
+      </w:r>
+      <w:proofErr w:type="spellStart"/>
+      <w:r>
+        <w:rPr>
+          <w:b/>
+          <w:bCs/>
+          <w:sz w:val="24"/>
+          <w:szCs w:val="24"/>
+        </w:rPr>
+        <w:t>json</w:t>
+      </w:r>
+      <w:proofErr w:type="spellEnd"/>
+      <w:r>
+        <w:rPr>
+          <w:b/>
+          <w:bCs/>
+          <w:sz w:val="24"/>
+          <w:szCs w:val="24"/>
+        </w:rPr>
+        <w:t xml:space="preserve"> manual</w:t>
+      </w:r>
+    </w:p>
+    <w:p>
+      <w:pPr>
+        <w:rPr>
+          <w:sz w:val="24"/>
+          <w:szCs w:val="24"/>
+        </w:rPr>
+      </w:pPr>
+    </w:p>
+    <w:p>
+      <w:pPr>
+        <w:rPr>
+          <w:sz w:val="24"/>
+          <w:szCs w:val="24"/>
+        </w:rPr>
+      </w:pPr>
+      <w:proofErr w:type="spellStart"/>
+      <w:r>
+        <w:rPr>
+          <w:sz w:val="24"/>
+          <w:szCs w:val="24"/>
+        </w:rPr>
+        <w:t>Untuk</w:t>
+      </w:r>
+      <w:proofErr w:type="spellEnd"/>
+      <w:r>
+        <w:rPr>
+          <w:sz w:val="24"/>
+          <w:szCs w:val="24"/>
+        </w:rPr>
+        <w:t xml:space="preserve"> </w:t>
+      </w:r>
+      <w:proofErr w:type="spellStart"/>
+      <w:r>
+        <w:rPr>
+          <w:sz w:val="24"/>
+          <w:szCs w:val="24"/>
+        </w:rPr>
+        <w:t>panduan</w:t>
+      </w:r>
+      <w:proofErr w:type="spellEnd"/>
+      <w:r>
+        <w:rPr>
+          <w:sz w:val="24"/>
+          <w:szCs w:val="24"/>
+        </w:rPr>
+        <w:t xml:space="preserve"> </w:t>
+      </w:r>
+      <w:proofErr w:type="spellStart"/>
+      <w:r>
+        <w:rPr>
+          <w:sz w:val="24"/>
+          <w:szCs w:val="24"/>
+        </w:rPr>
+        <w:t>lainnya</w:t>
+      </w:r>
+      <w:proofErr w:type="spellEnd"/>
+      <w:r>
+        <w:rPr>
+          <w:sz w:val="24"/>
+          <w:szCs w:val="24"/>
+        </w:rPr>
+        <w:t xml:space="preserve"> </w:t>
+      </w:r>
+      <w:proofErr w:type="spellStart"/>
+      <w:r>
+        <w:rPr>
+          <w:sz w:val="24"/>
+          <w:szCs w:val="24"/>
+        </w:rPr>
+        <w:t>menggunakan</w:t>
+      </w:r>
+      <w:proofErr w:type="spellEnd"/>
+      <w:r>
+        <w:rPr>
+          <w:sz w:val="24"/>
+          <w:szCs w:val="24"/>
+        </w:rPr>
+        <w:t xml:space="preserve"> software via </w:t>
+      </w:r>
+      <w:proofErr w:type="spellStart"/>
+      <w:r>
+        <w:rPr>
+          <w:sz w:val="24"/>
+          <w:szCs w:val="24"/>
+        </w:rPr>
+        <w:t>ada</w:t>
+      </w:r>
+      <w:proofErr w:type="spellEnd"/>
+      <w:r>
+        <w:rPr>
+          <w:sz w:val="24"/>
+          <w:szCs w:val="24"/>
+        </w:rPr>
+        <w:t xml:space="preserve"> dapat </w:t>
+      </w:r>
+      <w:proofErr w:type="spellStart"/>
+      <w:r>
+        <w:rPr>
+          <w:sz w:val="24"/>
+          <w:szCs w:val="24"/>
+        </w:rPr>
+        <w:t>membacanya</w:t>
+      </w:r>
+      <w:proofErr w:type="spellEnd"/>
+      <w:r>
+        <w:rPr>
+          <w:sz w:val="24"/>
+          <w:szCs w:val="24"/>
+        </w:rPr>
+        <w:t xml:space="preserve"> </w:t>
+      </w:r>
+      <w:proofErr w:type="spellStart"/>
+      <w:r>
+        <w:rPr>
+          <w:sz w:val="24"/>
+          <w:szCs w:val="24"/>
+        </w:rPr>
+        <w:t>disini</w:t>
+      </w:r>
+      <w:proofErr w:type="spellEnd"/>
+      <w:r>
+        <w:rPr>
+          <w:sz w:val="24"/>
+          <w:szCs w:val="24"/>
+        </w:rPr>
+        <w:t xml:space="preserve"> </w:t>
+      </w:r>
+      <w:hyperlink r:id="rId7">
         <w:r>
           <w:rPr>
             <w:color w:val="1155CC"/>
@@ -241,8 +1074,305 @@
           <w:sz w:val="24"/>
           <w:szCs w:val="24"/>
         </w:rPr>
-        <w:t>Pada via hanya dapat menyimpan maks 15 macro di seluruh layer. Ada beberapa trik untuk memaksimalkannya. Jika macro anda hanya kombinasi sederhana seperti CTRL + ALT + DEL maka anda dapat menggunakan fitur ANY keys pada tab special seperti dibawah</w:t>
-      </w:r>
+        <w:t xml:space="preserve">Pada via </w:t>
+      </w:r>
+      <w:proofErr w:type="spellStart"/>
+      <w:r>
+        <w:rPr>
+          <w:sz w:val="24"/>
+          <w:szCs w:val="24"/>
+        </w:rPr>
+        <w:t>hanya</w:t>
+      </w:r>
+      <w:proofErr w:type="spellEnd"/>
+      <w:r>
+        <w:rPr>
+          <w:sz w:val="24"/>
+          <w:szCs w:val="24"/>
+        </w:rPr>
+        <w:t xml:space="preserve"> dapat </w:t>
+      </w:r>
+      <w:proofErr w:type="spellStart"/>
+      <w:r>
+        <w:rPr>
+          <w:sz w:val="24"/>
+          <w:szCs w:val="24"/>
+        </w:rPr>
+        <w:t>menyimpan</w:t>
+      </w:r>
+      <w:proofErr w:type="spellEnd"/>
+      <w:r>
+        <w:rPr>
+          <w:sz w:val="24"/>
+          <w:szCs w:val="24"/>
+        </w:rPr>
+        <w:t xml:space="preserve"> </w:t>
+      </w:r>
+      <w:proofErr w:type="spellStart"/>
+      <w:r>
+        <w:rPr>
+          <w:sz w:val="24"/>
+          <w:szCs w:val="24"/>
+        </w:rPr>
+        <w:t>maks</w:t>
+      </w:r>
+      <w:proofErr w:type="spellEnd"/>
+      <w:r>
+        <w:rPr>
+          <w:sz w:val="24"/>
+          <w:szCs w:val="24"/>
+        </w:rPr>
+        <w:t xml:space="preserve"> 15 macro di </w:t>
+      </w:r>
+      <w:proofErr w:type="spellStart"/>
+      <w:r>
+        <w:rPr>
+          <w:sz w:val="24"/>
+          <w:szCs w:val="24"/>
+        </w:rPr>
+        <w:t>seluruh</w:t>
+      </w:r>
+      <w:proofErr w:type="spellEnd"/>
+      <w:r>
+        <w:rPr>
+          <w:sz w:val="24"/>
+          <w:szCs w:val="24"/>
+        </w:rPr>
+        <w:t xml:space="preserve"> layer. Ada </w:t>
+      </w:r>
+      <w:proofErr w:type="spellStart"/>
+      <w:r>
+        <w:rPr>
+          <w:sz w:val="24"/>
+          <w:szCs w:val="24"/>
+        </w:rPr>
+        <w:t>beberapa</w:t>
+      </w:r>
+      <w:proofErr w:type="spellEnd"/>
+      <w:r>
+        <w:rPr>
+          <w:sz w:val="24"/>
+          <w:szCs w:val="24"/>
+        </w:rPr>
+        <w:t xml:space="preserve"> </w:t>
+      </w:r>
+      <w:proofErr w:type="spellStart"/>
+      <w:r>
+        <w:rPr>
+          <w:sz w:val="24"/>
+          <w:szCs w:val="24"/>
+        </w:rPr>
+        <w:t>trik</w:t>
+      </w:r>
+      <w:proofErr w:type="spellEnd"/>
+      <w:r>
+        <w:rPr>
+          <w:sz w:val="24"/>
+          <w:szCs w:val="24"/>
+        </w:rPr>
+        <w:t xml:space="preserve"> </w:t>
+      </w:r>
+      <w:proofErr w:type="spellStart"/>
+      <w:r>
+        <w:rPr>
+          <w:sz w:val="24"/>
+          <w:szCs w:val="24"/>
+        </w:rPr>
+        <w:t>untuk</w:t>
+      </w:r>
+      <w:proofErr w:type="spellEnd"/>
+      <w:r>
+        <w:rPr>
+          <w:sz w:val="24"/>
+          <w:szCs w:val="24"/>
+        </w:rPr>
+        <w:t xml:space="preserve"> </w:t>
+      </w:r>
+      <w:proofErr w:type="spellStart"/>
+      <w:r>
+        <w:rPr>
+          <w:sz w:val="24"/>
+          <w:szCs w:val="24"/>
+        </w:rPr>
+        <w:t>memaksimalkannya</w:t>
+      </w:r>
+      <w:proofErr w:type="spellEnd"/>
+      <w:r>
+        <w:rPr>
+          <w:sz w:val="24"/>
+          <w:szCs w:val="24"/>
+        </w:rPr>
+        <w:t xml:space="preserve">. Jika macro </w:t>
+      </w:r>
+      <w:proofErr w:type="spellStart"/>
+      <w:r>
+        <w:rPr>
+          <w:sz w:val="24"/>
+          <w:szCs w:val="24"/>
+        </w:rPr>
+        <w:t>anda</w:t>
+      </w:r>
+      <w:proofErr w:type="spellEnd"/>
+      <w:r>
+        <w:rPr>
+          <w:sz w:val="24"/>
+          <w:szCs w:val="24"/>
+        </w:rPr>
+        <w:t xml:space="preserve"> </w:t>
+      </w:r>
+      <w:proofErr w:type="spellStart"/>
+      <w:r>
+        <w:rPr>
+          <w:sz w:val="24"/>
+          <w:szCs w:val="24"/>
+        </w:rPr>
+        <w:t>hanya</w:t>
+      </w:r>
+      <w:proofErr w:type="spellEnd"/>
+      <w:r>
+        <w:rPr>
+          <w:sz w:val="24"/>
+          <w:szCs w:val="24"/>
+        </w:rPr>
+        <w:t xml:space="preserve"> </w:t>
+      </w:r>
+      <w:proofErr w:type="spellStart"/>
+      <w:r>
+        <w:rPr>
+          <w:sz w:val="24"/>
+          <w:szCs w:val="24"/>
+        </w:rPr>
+        <w:t>kombinasi</w:t>
+      </w:r>
+      <w:proofErr w:type="spellEnd"/>
+      <w:r>
+        <w:rPr>
+          <w:sz w:val="24"/>
+          <w:szCs w:val="24"/>
+        </w:rPr>
+        <w:t xml:space="preserve"> </w:t>
+      </w:r>
+      <w:proofErr w:type="spellStart"/>
+      <w:r>
+        <w:rPr>
+          <w:sz w:val="24"/>
+          <w:szCs w:val="24"/>
+        </w:rPr>
+        <w:t>sederhana</w:t>
+      </w:r>
+      <w:proofErr w:type="spellEnd"/>
+      <w:r>
+        <w:rPr>
+          <w:sz w:val="24"/>
+          <w:szCs w:val="24"/>
+        </w:rPr>
+        <w:t xml:space="preserve"> </w:t>
+      </w:r>
+      <w:proofErr w:type="spellStart"/>
+      <w:r>
+        <w:rPr>
+          <w:sz w:val="24"/>
+          <w:szCs w:val="24"/>
+        </w:rPr>
+        <w:t>seperti</w:t>
+      </w:r>
+      <w:proofErr w:type="spellEnd"/>
+      <w:r>
+        <w:rPr>
+          <w:sz w:val="24"/>
+          <w:szCs w:val="24"/>
+        </w:rPr>
+        <w:t xml:space="preserve"> CTRL + ALT + DEL </w:t>
+      </w:r>
+      <w:proofErr w:type="spellStart"/>
+      <w:r>
+        <w:rPr>
+          <w:sz w:val="24"/>
+          <w:szCs w:val="24"/>
+        </w:rPr>
+        <w:t>maka</w:t>
+      </w:r>
+      <w:proofErr w:type="spellEnd"/>
+      <w:r>
+        <w:rPr>
+          <w:sz w:val="24"/>
+          <w:szCs w:val="24"/>
+        </w:rPr>
+        <w:t xml:space="preserve"> </w:t>
+      </w:r>
+      <w:proofErr w:type="spellStart"/>
+      <w:r>
+        <w:rPr>
+          <w:sz w:val="24"/>
+          <w:szCs w:val="24"/>
+        </w:rPr>
+        <w:t>anda</w:t>
+      </w:r>
+      <w:proofErr w:type="spellEnd"/>
+      <w:r>
+        <w:rPr>
+          <w:sz w:val="24"/>
+          <w:szCs w:val="24"/>
+        </w:rPr>
+        <w:t xml:space="preserve"> dapat </w:t>
+      </w:r>
+      <w:proofErr w:type="spellStart"/>
+      <w:r>
+        <w:rPr>
+          <w:sz w:val="24"/>
+          <w:szCs w:val="24"/>
+        </w:rPr>
+        <w:t>menggunakan</w:t>
+      </w:r>
+      <w:proofErr w:type="spellEnd"/>
+      <w:r>
+        <w:rPr>
+          <w:sz w:val="24"/>
+          <w:szCs w:val="24"/>
+        </w:rPr>
+        <w:t xml:space="preserve"> </w:t>
+      </w:r>
+      <w:proofErr w:type="spellStart"/>
+      <w:r>
+        <w:rPr>
+          <w:sz w:val="24"/>
+          <w:szCs w:val="24"/>
+        </w:rPr>
+        <w:t>fitur</w:t>
+      </w:r>
+      <w:proofErr w:type="spellEnd"/>
+      <w:r>
+        <w:rPr>
+          <w:sz w:val="24"/>
+          <w:szCs w:val="24"/>
+        </w:rPr>
+        <w:t xml:space="preserve"> ANY keys pada tab special </w:t>
+      </w:r>
+      <w:proofErr w:type="spellStart"/>
+      <w:r>
+        <w:rPr>
+          <w:sz w:val="24"/>
+          <w:szCs w:val="24"/>
+        </w:rPr>
+        <w:t>seperti</w:t>
+      </w:r>
+      <w:proofErr w:type="spellEnd"/>
+      <w:r>
+        <w:rPr>
+          <w:sz w:val="24"/>
+          <w:szCs w:val="24"/>
+        </w:rPr>
+        <w:t xml:space="preserve"> </w:t>
+      </w:r>
+      <w:proofErr w:type="spellStart"/>
+      <w:r>
+        <w:rPr>
+          <w:sz w:val="24"/>
+          <w:szCs w:val="24"/>
+        </w:rPr>
+        <w:t>dibawah</w:t>
+      </w:r>
+      <w:proofErr w:type="spellEnd"/>
     </w:p>
     <w:p>
       <w:pPr>
@@ -271,7 +1401,7 @@
                     <pic:cNvPicPr preferRelativeResize="0"/>
                   </pic:nvPicPr>
                   <pic:blipFill>
-                    <a:blip r:embed="rId7"/>
+                    <a:blip r:embed="rId8"/>
                     <a:srcRect/>
                     <a:stretch>
                       <a:fillRect/>
@@ -301,14 +1431,72 @@
           <w:szCs w:val="24"/>
         </w:rPr>
       </w:pPr>
-      <w:r>
-        <w:rPr>
-          <w:sz w:val="24"/>
-          <w:szCs w:val="24"/>
-        </w:rPr>
-        <w:t xml:space="preserve">Untuk jelasnya anda dapat membacanya di </w:t>
-      </w:r>
-      <w:hyperlink r:id="rId8">
+      <w:proofErr w:type="spellStart"/>
+      <w:r>
+        <w:rPr>
+          <w:sz w:val="24"/>
+          <w:szCs w:val="24"/>
+        </w:rPr>
+        <w:lastRenderedPageBreak/>
+        <w:t>Untuk</w:t>
+      </w:r>
+      <w:proofErr w:type="spellEnd"/>
+      <w:r>
+        <w:rPr>
+          <w:sz w:val="24"/>
+          <w:szCs w:val="24"/>
+        </w:rPr>
+        <w:t xml:space="preserve"> </w:t>
+      </w:r>
+      <w:proofErr w:type="spellStart"/>
+      <w:r>
+        <w:rPr>
+          <w:sz w:val="24"/>
+          <w:szCs w:val="24"/>
+        </w:rPr>
+        <w:t>jelasnya</w:t>
+      </w:r>
+      <w:proofErr w:type="spellEnd"/>
+      <w:r>
+        <w:rPr>
+          <w:sz w:val="24"/>
+          <w:szCs w:val="24"/>
+        </w:rPr>
+        <w:t xml:space="preserve"> </w:t>
+      </w:r>
+      <w:proofErr w:type="spellStart"/>
+      <w:r>
+        <w:rPr>
+          <w:sz w:val="24"/>
+          <w:szCs w:val="24"/>
+        </w:rPr>
+        <w:t>anda</w:t>
+      </w:r>
+      <w:proofErr w:type="spellEnd"/>
+      <w:r>
+        <w:rPr>
+          <w:sz w:val="24"/>
+          <w:szCs w:val="24"/>
+        </w:rPr>
+        <w:t xml:space="preserve"> dapat </w:t>
+      </w:r>
+      <w:proofErr w:type="spellStart"/>
+      <w:r>
+        <w:rPr>
+          <w:sz w:val="24"/>
+          <w:szCs w:val="24"/>
+        </w:rPr>
+        <w:t>membacanya</w:t>
+      </w:r>
+      <w:proofErr w:type="spellEnd"/>
+      <w:r>
+        <w:rPr>
+          <w:sz w:val="24"/>
+          <w:szCs w:val="24"/>
+        </w:rPr>
+        <w:t xml:space="preserve"> di </w:t>
+      </w:r>
+      <w:hyperlink r:id="rId9">
         <w:r>
           <w:rPr>
             <w:color w:val="1155CC"/>
@@ -330,9 +1518,30 @@
         <w:rPr>
           <w:b/>
         </w:rPr>
-        <w:lastRenderedPageBreak/>
-        <w:t>Cara Menggunakan Software VIA Pada Macropad</w:t>
-      </w:r>
+        <w:t xml:space="preserve">Cara </w:t>
+      </w:r>
+      <w:proofErr w:type="spellStart"/>
+      <w:r>
+        <w:rPr>
+          <w:b/>
+        </w:rPr>
+        <w:t>Menggunakan</w:t>
+      </w:r>
+      <w:proofErr w:type="spellEnd"/>
+      <w:r>
+        <w:rPr>
+          <w:b/>
+        </w:rPr>
+        <w:t xml:space="preserve"> Software VIA Pada </w:t>
+      </w:r>
+      <w:proofErr w:type="spellStart"/>
+      <w:r>
+        <w:rPr>
+          <w:b/>
+        </w:rPr>
+        <w:t>Macropad</w:t>
+      </w:r>
+      <w:proofErr w:type="spellEnd"/>
     </w:p>
     <w:p>
       <w:pPr>
@@ -341,8 +1550,29 @@
           <w:numId w:val="2"/>
         </w:numPr>
       </w:pPr>
-      <w:r>
-        <w:t>Colok dahulu Macropad pada PC</w:t>
+      <w:proofErr w:type="spellStart"/>
+      <w:r>
+        <w:t>Colok</w:t>
+      </w:r>
+      <w:proofErr w:type="spellEnd"/>
+      <w:r>
+        <w:t xml:space="preserve"> </w:t>
+      </w:r>
+      <w:proofErr w:type="spellStart"/>
+      <w:r>
+        <w:t>dahulu</w:t>
+      </w:r>
+      <w:proofErr w:type="spellEnd"/>
+      <w:r>
+        <w:t xml:space="preserve"> </w:t>
+      </w:r>
+      <w:proofErr w:type="spellStart"/>
+      <w:r>
+        <w:t>Macropad</w:t>
+      </w:r>
+      <w:proofErr w:type="spellEnd"/>
+      <w:r>
+        <w:t xml:space="preserve"> pada PC</w:t>
       </w:r>
     </w:p>
     <w:p>
@@ -364,7 +1594,23 @@
         </w:numPr>
       </w:pPr>
       <w:r>
-        <w:t>Pada Tab Setting , aktifkan “Show Design Tab”</w:t>
+        <w:t xml:space="preserve">Pada Tab </w:t>
+      </w:r>
+      <w:proofErr w:type="gramStart"/>
+      <w:r>
+        <w:t>Setting ,</w:t>
+      </w:r>
+      <w:proofErr w:type="gramEnd"/>
+      <w:r>
+        <w:t xml:space="preserve"> </w:t>
+      </w:r>
+      <w:proofErr w:type="spellStart"/>
+      <w:r>
+        <w:t>aktifkan</w:t>
+      </w:r>
+      <w:proofErr w:type="spellEnd"/>
+      <w:r>
+        <w:t xml:space="preserve"> “Show Design Tab”</w:t>
       </w:r>
     </w:p>
     <w:p>
@@ -386,8 +1632,37 @@
         </w:numPr>
       </w:pPr>
       <w:r>
-        <w:t>Load file extension “json” di google drive yang di berikan</w:t>
-      </w:r>
+        <w:t>Load file extension “</w:t>
+      </w:r>
+      <w:proofErr w:type="spellStart"/>
+      <w:r>
+        <w:t>json</w:t>
+      </w:r>
+      <w:proofErr w:type="spellEnd"/>
+      <w:r>
+        <w:t xml:space="preserve">” di </w:t>
+      </w:r>
+      <w:proofErr w:type="spellStart"/>
+      <w:proofErr w:type="gramStart"/>
+      <w:r>
+        <w:t>github</w:t>
+      </w:r>
+      <w:proofErr w:type="spellEnd"/>
+      <w:r>
+        <w:t xml:space="preserve"> </w:t>
+      </w:r>
+      <w:r>
+        <w:t xml:space="preserve"> yang</w:t>
+      </w:r>
+      <w:proofErr w:type="gramEnd"/>
+      <w:r>
+        <w:t xml:space="preserve"> di </w:t>
+      </w:r>
+      <w:proofErr w:type="spellStart"/>
+      <w:r>
+        <w:t>berikan</w:t>
+      </w:r>
+      <w:proofErr w:type="spellEnd"/>
     </w:p>
     <w:p>
       <w:pPr>
@@ -397,7 +1672,23 @@
         </w:numPr>
       </w:pPr>
       <w:r>
-        <w:t>Buka tab Configure untuk melakukan setting</w:t>
+        <w:t xml:space="preserve">Buka tab Configure </w:t>
+      </w:r>
+      <w:proofErr w:type="spellStart"/>
+      <w:r>
+        <w:t>untuk</w:t>
+      </w:r>
+      <w:proofErr w:type="spellEnd"/>
+      <w:r>
+        <w:t xml:space="preserve"> </w:t>
+      </w:r>
+      <w:proofErr w:type="spellStart"/>
+      <w:r>
+        <w:t>melakukan</w:t>
+      </w:r>
+      <w:proofErr w:type="spellEnd"/>
+      <w:r>
+        <w:t xml:space="preserve"> setting</w:t>
       </w:r>
     </w:p>
     <w:p>
@@ -408,20 +1699,126 @@
         </w:numPr>
       </w:pPr>
       <w:r>
-        <w:t>Jika masih muncul gambar searching, maka ulangi lagi load json file</w:t>
-      </w:r>
-    </w:p>
-    <w:p>
-      <w:pPr>
-        <w:rPr>
-          <w:b/>
-        </w:rPr>
-      </w:pPr>
-      <w:r>
-        <w:rPr>
-          <w:b/>
-        </w:rPr>
-        <w:t>Lakukan Hal ini setiap kali ingin setting macropad di VIA</w:t>
+        <w:t xml:space="preserve">Jika </w:t>
+      </w:r>
+      <w:proofErr w:type="spellStart"/>
+      <w:r>
+        <w:t>masih</w:t>
+      </w:r>
+      <w:proofErr w:type="spellEnd"/>
+      <w:r>
+        <w:t xml:space="preserve"> </w:t>
+      </w:r>
+      <w:proofErr w:type="spellStart"/>
+      <w:r>
+        <w:t>muncul</w:t>
+      </w:r>
+      <w:proofErr w:type="spellEnd"/>
+      <w:r>
+        <w:t xml:space="preserve"> </w:t>
+      </w:r>
+      <w:proofErr w:type="spellStart"/>
+      <w:r>
+        <w:t>gambar</w:t>
+      </w:r>
+      <w:proofErr w:type="spellEnd"/>
+      <w:r>
+        <w:t xml:space="preserve"> searching, </w:t>
+      </w:r>
+      <w:proofErr w:type="spellStart"/>
+      <w:r>
+        <w:t>maka</w:t>
+      </w:r>
+      <w:proofErr w:type="spellEnd"/>
+      <w:r>
+        <w:t xml:space="preserve"> </w:t>
+      </w:r>
+      <w:proofErr w:type="spellStart"/>
+      <w:r>
+        <w:t>ulangi</w:t>
+      </w:r>
+      <w:proofErr w:type="spellEnd"/>
+      <w:r>
+        <w:t xml:space="preserve"> </w:t>
+      </w:r>
+      <w:proofErr w:type="spellStart"/>
+      <w:r>
+        <w:t>lagi</w:t>
+      </w:r>
+      <w:proofErr w:type="spellEnd"/>
+      <w:r>
+        <w:t xml:space="preserve"> load </w:t>
+      </w:r>
+      <w:proofErr w:type="spellStart"/>
+      <w:r>
+        <w:t>json</w:t>
+      </w:r>
+      <w:proofErr w:type="spellEnd"/>
+      <w:r>
+        <w:t xml:space="preserve"> file</w:t>
+      </w:r>
+    </w:p>
+    <w:p>
+      <w:pPr>
+        <w:rPr>
+          <w:b/>
+        </w:rPr>
+      </w:pPr>
+      <w:proofErr w:type="spellStart"/>
+      <w:r>
+        <w:rPr>
+          <w:b/>
+        </w:rPr>
+        <w:t>Lakukan</w:t>
+      </w:r>
+      <w:proofErr w:type="spellEnd"/>
+      <w:r>
+        <w:rPr>
+          <w:b/>
+        </w:rPr>
+        <w:t xml:space="preserve"> Hal ini </w:t>
+      </w:r>
+      <w:proofErr w:type="spellStart"/>
+      <w:r>
+        <w:rPr>
+          <w:b/>
+        </w:rPr>
+        <w:t>setiap</w:t>
+      </w:r>
+      <w:proofErr w:type="spellEnd"/>
+      <w:r>
+        <w:rPr>
+          <w:b/>
+        </w:rPr>
+        <w:t xml:space="preserve"> kali </w:t>
+      </w:r>
+      <w:proofErr w:type="spellStart"/>
+      <w:r>
+        <w:rPr>
+          <w:b/>
+        </w:rPr>
+        <w:t>ingin</w:t>
+      </w:r>
+      <w:proofErr w:type="spellEnd"/>
+      <w:r>
+        <w:rPr>
+          <w:b/>
+        </w:rPr>
+        <w:t xml:space="preserve"> setting </w:t>
+      </w:r>
+      <w:proofErr w:type="spellStart"/>
+      <w:r>
+        <w:rPr>
+          <w:b/>
+        </w:rPr>
+        <w:t>macropad</w:t>
+      </w:r>
+      <w:proofErr w:type="spellEnd"/>
+      <w:r>
+        <w:rPr>
+          <w:b/>
+        </w:rPr>
+        <w:t xml:space="preserve"> di VIA</w:t>
       </w:r>
     </w:p>
     <w:p>
@@ -449,7 +1846,7 @@
                     <pic:cNvPicPr preferRelativeResize="0"/>
                   </pic:nvPicPr>
                   <pic:blipFill>
-                    <a:blip r:embed="rId9"/>
+                    <a:blip r:embed="rId10"/>
                     <a:srcRect/>
                     <a:stretch>
                       <a:fillRect/>
@@ -493,12 +1890,129 @@
       </w:r>
     </w:p>
     <w:p>
-      <w:r>
-        <w:t xml:space="preserve">Untuk melakukan setting di knob perlu memasukan command berupa keycode qmk, Jadi cara nya sama dengan melakuykan setting dengan Any key seperti petunjuk pada link berikut: </w:t>
-      </w:r>
-    </w:p>
-    <w:p>
-      <w:hyperlink r:id="rId10">
+      <w:proofErr w:type="spellStart"/>
+      <w:r>
+        <w:t>Untuk</w:t>
+      </w:r>
+      <w:proofErr w:type="spellEnd"/>
+      <w:r>
+        <w:t xml:space="preserve"> </w:t>
+      </w:r>
+      <w:proofErr w:type="spellStart"/>
+      <w:r>
+        <w:t>melakukan</w:t>
+      </w:r>
+      <w:proofErr w:type="spellEnd"/>
+      <w:r>
+        <w:t xml:space="preserve"> setting di knob </w:t>
+      </w:r>
+      <w:proofErr w:type="spellStart"/>
+      <w:r>
+        <w:t>perlu</w:t>
+      </w:r>
+      <w:proofErr w:type="spellEnd"/>
+      <w:r>
+        <w:t xml:space="preserve"> </w:t>
+      </w:r>
+      <w:proofErr w:type="spellStart"/>
+      <w:r>
+        <w:t>memasukan</w:t>
+      </w:r>
+      <w:proofErr w:type="spellEnd"/>
+      <w:r>
+        <w:t xml:space="preserve"> command </w:t>
+      </w:r>
+      <w:proofErr w:type="spellStart"/>
+      <w:r>
+        <w:t>berupa</w:t>
+      </w:r>
+      <w:proofErr w:type="spellEnd"/>
+      <w:r>
+        <w:t xml:space="preserve"> keycode </w:t>
+      </w:r>
+      <w:proofErr w:type="spellStart"/>
+      <w:r>
+        <w:t>qmk</w:t>
+      </w:r>
+      <w:proofErr w:type="spellEnd"/>
+      <w:r>
+        <w:t xml:space="preserve">, Jadi </w:t>
+      </w:r>
+      <w:proofErr w:type="spellStart"/>
+      <w:r>
+        <w:t>cara</w:t>
+      </w:r>
+      <w:proofErr w:type="spellEnd"/>
+      <w:r>
+        <w:t xml:space="preserve"> </w:t>
+      </w:r>
+      <w:proofErr w:type="spellStart"/>
+      <w:r>
+        <w:t>nya</w:t>
+      </w:r>
+      <w:proofErr w:type="spellEnd"/>
+      <w:r>
+        <w:t xml:space="preserve"> </w:t>
+      </w:r>
+      <w:proofErr w:type="spellStart"/>
+      <w:r>
+        <w:t>sama</w:t>
+      </w:r>
+      <w:proofErr w:type="spellEnd"/>
+      <w:r>
+        <w:t xml:space="preserve"> </w:t>
+      </w:r>
+      <w:proofErr w:type="spellStart"/>
+      <w:r>
+        <w:t>dengan</w:t>
+      </w:r>
+      <w:proofErr w:type="spellEnd"/>
+      <w:r>
+        <w:t xml:space="preserve"> </w:t>
+      </w:r>
+      <w:proofErr w:type="spellStart"/>
+      <w:r>
+        <w:t>melakuykan</w:t>
+      </w:r>
+      <w:proofErr w:type="spellEnd"/>
+      <w:r>
+        <w:t xml:space="preserve"> setting </w:t>
+      </w:r>
+      <w:proofErr w:type="spellStart"/>
+      <w:r>
+        <w:t>dengan</w:t>
+      </w:r>
+      <w:proofErr w:type="spellEnd"/>
+      <w:r>
+        <w:t xml:space="preserve"> Any key </w:t>
+      </w:r>
+      <w:proofErr w:type="spellStart"/>
+      <w:r>
+        <w:t>seperti</w:t>
+      </w:r>
+      <w:proofErr w:type="spellEnd"/>
+      <w:r>
+        <w:t xml:space="preserve"> </w:t>
+      </w:r>
+      <w:proofErr w:type="spellStart"/>
+      <w:r>
+        <w:t>petunjuk</w:t>
+      </w:r>
+      <w:proofErr w:type="spellEnd"/>
+      <w:r>
+        <w:t xml:space="preserve"> pada link </w:t>
+      </w:r>
+      <w:proofErr w:type="spellStart"/>
+      <w:r>
+        <w:t>berikut</w:t>
+      </w:r>
+      <w:proofErr w:type="spellEnd"/>
+      <w:r>
+        <w:t xml:space="preserve">: </w:t>
+      </w:r>
+    </w:p>
+    <w:p>
+      <w:hyperlink r:id="rId11">
         <w:r>
           <w:rPr>
             <w:color w:val="1155CC"/>
@@ -575,7 +2089,23 @@
           <w:sz w:val="24"/>
           <w:szCs w:val="24"/>
         </w:rPr>
-        <w:t>LGUI(KC_C) - Sends Cmd-C or Win-C</w:t>
+        <w:t xml:space="preserve">LGUI(KC_C) - Sends </w:t>
+      </w:r>
+      <w:proofErr w:type="spellStart"/>
+      <w:r>
+        <w:rPr>
+          <w:sz w:val="24"/>
+          <w:szCs w:val="24"/>
+        </w:rPr>
+        <w:t>Cmd</w:t>
+      </w:r>
+      <w:proofErr w:type="spellEnd"/>
+      <w:r>
+        <w:rPr>
+          <w:sz w:val="24"/>
+          <w:szCs w:val="24"/>
+        </w:rPr>
+        <w:t>-C or Win-C</w:t>
       </w:r>
     </w:p>
     <w:p>
@@ -600,12 +2130,21 @@
           <w:szCs w:val="24"/>
         </w:rPr>
       </w:pPr>
-      <w:r>
-        <w:rPr>
-          <w:sz w:val="24"/>
-          <w:szCs w:val="24"/>
-        </w:rPr>
-        <w:t>MO(1) - Momentarily turn on layer 1</w:t>
+      <w:proofErr w:type="gramStart"/>
+      <w:r>
+        <w:rPr>
+          <w:sz w:val="24"/>
+          <w:szCs w:val="24"/>
+        </w:rPr>
+        <w:t>MO(</w:t>
+      </w:r>
+      <w:proofErr w:type="gramEnd"/>
+      <w:r>
+        <w:rPr>
+          <w:sz w:val="24"/>
+          <w:szCs w:val="24"/>
+        </w:rPr>
+        <w:t>1) - Momentarily turn on layer 1</w:t>
       </w:r>
     </w:p>
     <w:p>
@@ -630,27 +2169,61 @@
           <w:szCs w:val="24"/>
         </w:rPr>
       </w:pPr>
-      <w:r>
-        <w:rPr>
-          <w:sz w:val="24"/>
-          <w:szCs w:val="24"/>
-        </w:rPr>
-        <w:t>MT(MOD_RSFT, KC_ENT) - Sends Shift if held, Enter if tapped</w:t>
-      </w:r>
-    </w:p>
-    <w:p>
-      <w:pPr>
-        <w:rPr>
-          <w:sz w:val="24"/>
-          <w:szCs w:val="24"/>
-        </w:rPr>
-      </w:pPr>
-      <w:r>
-        <w:rPr>
-          <w:sz w:val="24"/>
-          <w:szCs w:val="24"/>
-        </w:rPr>
-        <w:t>MACRO(0) – Macro 0</w:t>
+      <w:proofErr w:type="gramStart"/>
+      <w:r>
+        <w:rPr>
+          <w:sz w:val="24"/>
+          <w:szCs w:val="24"/>
+        </w:rPr>
+        <w:t>MT(</w:t>
+      </w:r>
+      <w:proofErr w:type="gramEnd"/>
+      <w:r>
+        <w:rPr>
+          <w:sz w:val="24"/>
+          <w:szCs w:val="24"/>
+        </w:rPr>
+        <w:t xml:space="preserve">MOD_RSFT, KC_ENT) - Sends Shift if held, </w:t>
+      </w:r>
+      <w:proofErr w:type="gramStart"/>
+      <w:r>
+        <w:rPr>
+          <w:sz w:val="24"/>
+          <w:szCs w:val="24"/>
+        </w:rPr>
+        <w:t>Enter</w:t>
+      </w:r>
+      <w:proofErr w:type="gramEnd"/>
+      <w:r>
+        <w:rPr>
+          <w:sz w:val="24"/>
+          <w:szCs w:val="24"/>
+        </w:rPr>
+        <w:t xml:space="preserve"> if tapped</w:t>
+      </w:r>
+    </w:p>
+    <w:p>
+      <w:pPr>
+        <w:rPr>
+          <w:sz w:val="24"/>
+          <w:szCs w:val="24"/>
+        </w:rPr>
+      </w:pPr>
+      <w:proofErr w:type="gramStart"/>
+      <w:r>
+        <w:rPr>
+          <w:sz w:val="24"/>
+          <w:szCs w:val="24"/>
+        </w:rPr>
+        <w:t>MACRO(</w:t>
+      </w:r>
+      <w:proofErr w:type="gramEnd"/>
+      <w:r>
+        <w:rPr>
+          <w:sz w:val="24"/>
+          <w:szCs w:val="24"/>
+        </w:rPr>
+        <w:t>0) – Macro 0</w:t>
       </w:r>
     </w:p>
     <w:p>
@@ -672,7 +2245,7 @@
 </file>
 
 <file path=word/numbering.xml><?xml version="1.0" encoding="utf-8"?>
-<w:numbering xmlns:wpc="http://schemas.microsoft.com/office/word/2010/wordprocessingCanvas" xmlns:cx="http://schemas.microsoft.com/office/drawing/2014/chartex" xmlns:cx1="http://schemas.microsoft.com/office/drawing/2015/9/8/chartex" xmlns:cx2="http://schemas.microsoft.com/office/drawing/2015/10/21/chartex" xmlns:cx3="http://schemas.microsoft.com/office/drawing/2016/5/9/chartex" xmlns:cx4="http://schemas.microsoft.com/office/drawing/2016/5/10/chartex" xmlns:cx5="http://schemas.microsoft.com/office/drawing/2016/5/11/chartex" xmlns:cx6="http://schemas.microsoft.com/office/drawing/2016/5/12/chartex" xmlns:cx7="http://schemas.microsoft.com/office/drawing/2016/5/13/chartex" xmlns:cx8="http://schemas.microsoft.com/office/drawing/2016/5/14/chartex" xmlns:mc="http://schemas.openxmlformats.org/markup-compatibility/2006" xmlns:aink="http://schemas.microsoft.com/office/drawing/2016/ink" xmlns:am3d="http://schemas.microsoft.com/office/drawing/2017/model3d" xmlns:o="urn:schemas-microsoft-com:office:office" xmlns:oel="http://schemas.microsoft.com/office/2019/extlst" xmlns:r="http://schemas.openxmlformats.org/officeDocument/2006/relationships" xmlns:m="http://schemas.openxmlformats.org/officeDocument/2006/math" xmlns:v="urn:schemas-microsoft-com:vml" xmlns:wp14="http://schemas.microsoft.com/office/word/2010/wordprocessingDrawing" xmlns:wp="http://schemas.openxmlformats.org/drawingml/2006/wordprocessingDrawing" xmlns:w10="urn:schemas-microsoft-com:office:word" xmlns:w="http://schemas.openxmlformats.org/wordprocessingml/2006/main" xmlns:w14="http://schemas.microsoft.com/office/word/2010/wordml" xmlns:w15="http://schemas.microsoft.com/office/word/2012/wordml" xmlns:w16cex="http://schemas.microsoft.com/office/word/2018/wordml/cex" xmlns:w16cid="http://schemas.microsoft.com/office/word/2016/wordml/cid" xmlns:w16="http://schemas.microsoft.com/office/word/2018/wordml" xmlns:w16du="http://schemas.microsoft.com/office/word/2023/wordml/word16du" xmlns:w16sdtdh="http://schemas.microsoft.com/office/word/2020/wordml/sdtdatahash" xmlns:w16se="http://schemas.microsoft.com/office/word/2015/wordml/symex" xmlns:wpg="http://schemas.microsoft.com/office/word/2010/wordprocessingGroup" xmlns:wpi="http://schemas.microsoft.com/office/word/2010/wordprocessingInk" xmlns:wne="http://schemas.microsoft.com/office/word/2006/wordml" xmlns:wps="http://schemas.microsoft.com/office/word/2010/wordprocessingShape" mc:Ignorable="w14 w15 w16se w16cid w16 w16cex w16sdtdh w16du wp14">
+<w:numbering xmlns:wpc="http://schemas.microsoft.com/office/word/2010/wordprocessingCanvas" xmlns:cx="http://schemas.microsoft.com/office/drawing/2014/chartex" xmlns:cx1="http://schemas.microsoft.com/office/drawing/2015/9/8/chartex" xmlns:cx2="http://schemas.microsoft.com/office/drawing/2015/10/21/chartex" xmlns:cx3="http://schemas.microsoft.com/office/drawing/2016/5/9/chartex" xmlns:cx4="http://schemas.microsoft.com/office/drawing/2016/5/10/chartex" xmlns:cx5="http://schemas.microsoft.com/office/drawing/2016/5/11/chartex" xmlns:cx6="http://schemas.microsoft.com/office/drawing/2016/5/12/chartex" xmlns:cx7="http://schemas.microsoft.com/office/drawing/2016/5/13/chartex" xmlns:cx8="http://schemas.microsoft.com/office/drawing/2016/5/14/chartex" xmlns:mc="http://schemas.openxmlformats.org/markup-compatibility/2006" xmlns:aink="http://schemas.microsoft.com/office/drawing/2016/ink" xmlns:am3d="http://schemas.microsoft.com/office/drawing/2017/model3d" xmlns:o="urn:schemas-microsoft-com:office:office" xmlns:oel="http://schemas.microsoft.com/office/2019/extlst" xmlns:r="http://schemas.openxmlformats.org/officeDocument/2006/relationships" xmlns:m="http://schemas.openxmlformats.org/officeDocument/2006/math" xmlns:v="urn:schemas-microsoft-com:vml" xmlns:wp14="http://schemas.microsoft.com/office/word/2010/wordprocessingDrawing" xmlns:wp="http://schemas.openxmlformats.org/drawingml/2006/wordprocessingDrawing" xmlns:w10="urn:schemas-microsoft-com:office:word" xmlns:w="http://schemas.openxmlformats.org/wordprocessingml/2006/main" xmlns:w14="http://schemas.microsoft.com/office/word/2010/wordml" xmlns:w15="http://schemas.microsoft.com/office/word/2012/wordml" xmlns:w16cex="http://schemas.microsoft.com/office/word/2018/wordml/cex" xmlns:w16cid="http://schemas.microsoft.com/office/word/2016/wordml/cid" xmlns:w16="http://schemas.microsoft.com/office/word/2018/wordml" xmlns:w16du="http://schemas.microsoft.com/office/word/2023/wordml/word16du" xmlns:w16sdtdh="http://schemas.microsoft.com/office/word/2020/wordml/sdtdatahash" xmlns:w16sdtfl="http://schemas.microsoft.com/office/word/2024/wordml/sdtformatlock" xmlns:w16se="http://schemas.microsoft.com/office/word/2015/wordml/symex" xmlns:wpg="http://schemas.microsoft.com/office/word/2010/wordprocessingGroup" xmlns:wpi="http://schemas.microsoft.com/office/word/2010/wordprocessingInk" xmlns:wne="http://schemas.microsoft.com/office/word/2006/wordml" xmlns:wps="http://schemas.microsoft.com/office/word/2010/wordprocessingShape" mc:Ignorable="w14 w15 w16se w16cid w16 w16cex w16sdtdh w16sdtfl w16du wp14">
   <w:abstractNum w:abstractNumId="0" w15:restartNumberingAfterBreak="0">
     <w:nsid w:val="56107589"/>
     <w:multiLevelType w:val="multilevel"/>
@@ -1025,7 +2598,7 @@
 </file>
 
 <file path=word/styles.xml><?xml version="1.0" encoding="utf-8"?>
-<w:styles xmlns:mc="http://schemas.openxmlformats.org/markup-compatibility/2006" xmlns:r="http://schemas.openxmlformats.org/officeDocument/2006/relationships" xmlns:w="http://schemas.openxmlformats.org/wordprocessingml/2006/main" xmlns:w14="http://schemas.microsoft.com/office/word/2010/wordml" xmlns:w15="http://schemas.microsoft.com/office/word/2012/wordml" xmlns:w16cex="http://schemas.microsoft.com/office/word/2018/wordml/cex" xmlns:w16cid="http://schemas.microsoft.com/office/word/2016/wordml/cid" xmlns:w16="http://schemas.microsoft.com/office/word/2018/wordml" xmlns:w16du="http://schemas.microsoft.com/office/word/2023/wordml/word16du" xmlns:w16sdtdh="http://schemas.microsoft.com/office/word/2020/wordml/sdtdatahash" xmlns:w16se="http://schemas.microsoft.com/office/word/2015/wordml/symex" mc:Ignorable="w14 w15 w16se w16cid w16 w16cex w16sdtdh w16du">
+<w:styles xmlns:mc="http://schemas.openxmlformats.org/markup-compatibility/2006" xmlns:r="http://schemas.openxmlformats.org/officeDocument/2006/relationships" xmlns:w="http://schemas.openxmlformats.org/wordprocessingml/2006/main" xmlns:w14="http://schemas.microsoft.com/office/word/2010/wordml" xmlns:w15="http://schemas.microsoft.com/office/word/2012/wordml" xmlns:w16cex="http://schemas.microsoft.com/office/word/2018/wordml/cex" xmlns:w16cid="http://schemas.microsoft.com/office/word/2016/wordml/cid" xmlns:w16="http://schemas.microsoft.com/office/word/2018/wordml" xmlns:w16du="http://schemas.microsoft.com/office/word/2023/wordml/word16du" xmlns:w16sdtdh="http://schemas.microsoft.com/office/word/2020/wordml/sdtdatahash" xmlns:w16sdtfl="http://schemas.microsoft.com/office/word/2024/wordml/sdtformatlock" xmlns:w16se="http://schemas.microsoft.com/office/word/2015/wordml/symex" mc:Ignorable="w14 w15 w16se w16cid w16 w16cex w16sdtdh w16sdtfl w16du">
   <w:docDefaults>
     <w:rPrDefault>
       <w:rPr>
@@ -1596,6 +3169,29 @@
       <w:szCs w:val="30"/>
     </w:rPr>
   </w:style>
+  <w:style w:type="character" w:styleId="Hyperlink">
+    <w:name w:val="Hyperlink"/>
+    <w:basedOn w:val="DefaultParagraphFont"/>
+    <w:uiPriority w:val="99"/>
+    <w:unhideWhenUsed/>
+    <w:rsid w:val="00A22598"/>
+    <w:rPr>
+      <w:color w:val="0000FF" w:themeColor="hyperlink"/>
+      <w:u w:val="single"/>
+    </w:rPr>
+  </w:style>
+  <w:style w:type="character" w:styleId="UnresolvedMention">
+    <w:name w:val="Unresolved Mention"/>
+    <w:basedOn w:val="DefaultParagraphFont"/>
+    <w:uiPriority w:val="99"/>
+    <w:semiHidden/>
+    <w:unhideWhenUsed/>
+    <w:rsid w:val="00A22598"/>
+    <w:rPr>
+      <w:color w:val="605E5C"/>
+      <w:shd w:val="clear" w:color="auto" w:fill="E1DFDD"/>
+    </w:rPr>
+  </w:style>
 </w:styles>
 </file>
 

</xml_diff>